<commit_message>
Update final project documentation
</commit_message>
<xml_diff>
--- a/EWaste_Final_Project_Documentation.docx
+++ b/EWaste_Final_Project_Documentation.docx
@@ -3217,6 +3217,108 @@
     <w:p>
       <w:r>
         <w:br w:type="page"/>
+      </w:r>
+    </w:p>
+    <w:p>
+      <w:pPr>
+        <w:pStyle w:val="Heading1"/>
+      </w:pPr>
+      <w:r>
+        <w:t xml:space="preserve">Latest Implementation Updates</w:t>
+      </w:r>
+    </w:p>
+    <w:p>
+      <w:r>
+        <w:t xml:space="preserve">This section records the final workflow and reporting changes implemented after the main documentation was prepared.</w:t>
+      </w:r>
+    </w:p>
+    <w:p>
+      <w:pPr>
+        <w:pStyle w:val="ListBullet"/>
+        <w:ind w:left="360" w:hanging="180"/>
+      </w:pPr>
+      <w:r>
+        <w:t xml:space="preserve">Customer recycled weight now includes pickups in PROCESSING and COMPLETED states, while excluding unprocessed pickups.</w:t>
+      </w:r>
+    </w:p>
+    <w:p>
+      <w:pPr>
+        <w:pStyle w:val="ListBullet"/>
+        <w:ind w:left="360" w:hanging="180"/>
+      </w:pPr>
+      <w:r>
+        <w:t xml:space="preserve">Administrator recycled-weight metrics now count only items belonging to PROCESSING or COMPLETED pickups.</w:t>
+      </w:r>
+    </w:p>
+    <w:p>
+      <w:pPr>
+        <w:pStyle w:val="ListBullet"/>
+        <w:ind w:left="360" w:hanging="180"/>
+      </w:pPr>
+      <w:r>
+        <w:t xml:space="preserve">Administrator analytics charts now use live processing-outcome and pickup-status data instead of hard-coded sample values.</w:t>
+      </w:r>
+    </w:p>
+    <w:p>
+      <w:pPr>
+        <w:pStyle w:val="ListBullet"/>
+        <w:ind w:left="360" w:hanging="180"/>
+      </w:pPr>
+      <w:r>
+        <w:t xml:space="preserve">The hazardous-waste ratio is displayed using the correct percentage scale.</w:t>
+      </w:r>
+    </w:p>
+    <w:p>
+      <w:pPr>
+        <w:pStyle w:val="ListBullet"/>
+        <w:ind w:left="360" w:hanging="180"/>
+      </w:pPr>
+      <w:r>
+        <w:t xml:space="preserve">The facility screen filters processing workflows according to item hazard status and condition; hazardous items use HAZARDOUS_DISPOSAL.</w:t>
+      </w:r>
+    </w:p>
+    <w:p>
+      <w:pPr>
+        <w:pStyle w:val="ListBullet"/>
+        <w:ind w:left="360" w:hanging="180"/>
+      </w:pPr>
+      <w:r>
+        <w:t xml:space="preserve">Successful facility processing advances a pickup through DELIVERED to PROCESSING and then COMPLETED.</w:t>
+      </w:r>
+    </w:p>
+    <w:p>
+      <w:pPr>
+        <w:pStyle w:val="ListBullet"/>
+        <w:ind w:left="360" w:hanging="180"/>
+      </w:pPr>
+      <w:r>
+        <w:t xml:space="preserve">Duplicate processing attempts are rejected before another processing record or reward is created.</w:t>
+      </w:r>
+    </w:p>
+    <w:p>
+      <w:pPr>
+        <w:pStyle w:val="ListBullet"/>
+        <w:ind w:left="360" w:hanging="180"/>
+      </w:pPr>
+      <w:r>
+        <w:t xml:space="preserve">Business-rule failures are returned as clear client-visible errors instead of generic internal-server errors.</w:t>
+      </w:r>
+    </w:p>
+    <w:p>
+      <w:pPr>
+        <w:pStyle w:val="ListBullet"/>
+        <w:ind w:left="360" w:hanging="180"/>
+      </w:pPr>
+      <w:r>
+        <w:t xml:space="preserve">Integration tests verify processing persistence, reward creation, completion state, and duplicate-processing protection.</w:t>
+      </w:r>
+    </w:p>
+    <w:p>
+      <w:pPr>
+        <w:pStyle w:val="Normal"/>
+      </w:pPr>
+      <w:r>
+        <w:t xml:space="preserve">The current processing implementation is designed for the delivered pickup selected in the facility workflow. Existing historical records that were already left in PROCESSING remain unchanged unless separately migrated.</w:t>
       </w:r>
     </w:p>
     <w:p>

</xml_diff>